<commit_message>
feat(uc10): danh so lai ma nguon tu dong 1 va dong bo toan bo bao cao kiem thu hop trang UC10
</commit_message>
<xml_diff>
--- a/hop-trang/KiemThuHopTrang_UC10_LenLichPhongVan.docx
+++ b/hop-trang/KiemThuHopTrang_UC10_LenLichPhongVan.docx
@@ -356,197 +356,197 @@
           <w:color w:val="333333"/>
           <w:sz w:val="17"/>
         </w:rPr>
-        <w:t>26: export class ScheduleInterviewUseCase {</w:t>
+        <w:t>1:  export class ScheduleInterviewUseCase {</w:t>
         <w:br/>
-        <w:t>27:   constructor(</w:t>
+        <w:t>2:    constructor(</w:t>
         <w:br/>
-        <w:t>28:     private readonly candidateRepo: ICandidateReadRepo &amp; ICandidateWriteRepo,</w:t>
+        <w:t>3:      private readonly candidateRepo: ICandidateReadRepo &amp; ICandidateWriteRepo,</w:t>
         <w:br/>
-        <w:t>29:     private readonly jobRepo: IJobReadRepo,</w:t>
+        <w:t>4:      private readonly jobRepo: IJobReadRepo,</w:t>
         <w:br/>
-        <w:t>30:     private readonly aiAnalysisRepo: IAnalysisReadRepo,</w:t>
+        <w:t>5:      private readonly aiAnalysisRepo: IAnalysisReadRepo,</w:t>
         <w:br/>
-        <w:t>31:     private readonly interviewScheduleRepo: IInterviewScheduleRepository,</w:t>
+        <w:t>6:      private readonly interviewScheduleRepo: IInterviewScheduleRepository,</w:t>
         <w:br/>
-        <w:t>32:     private readonly geminiSvc: IAIService,</w:t>
+        <w:t>7:      private readonly geminiSvc: IAIService,</w:t>
         <w:br/>
-        <w:t>33:     private readonly mailSvc: IMailService,</w:t>
+        <w:t>8:      private readonly mailSvc: IMailService,</w:t>
         <w:br/>
-        <w:t>34:   ) { }</w:t>
+        <w:t>9:    ) { }</w:t>
         <w:br/>
-        <w:t xml:space="preserve">35: </w:t>
+        <w:t xml:space="preserve">10: </w:t>
         <w:br/>
-        <w:t>36:   async execute(input: ScheduleInterviewInput): Promise&lt;ScheduleInterviewResult&gt; {</w:t>
+        <w:t>11:   async execute(input: ScheduleInterviewInput): Promise&lt;ScheduleInterviewResult&gt; {</w:t>
         <w:br/>
-        <w:t>37:     if (!input.candidateID || !input.jobID) {</w:t>
+        <w:t>12:     if (!input.candidateID || !input.jobID) {</w:t>
         <w:br/>
-        <w:t>38:       throw new Error('Mã ứng viên và mã công việc không được để trống.');</w:t>
+        <w:t>13:       throw new Error('Mã ứng viên và mã công việc không được để trống.');</w:t>
         <w:br/>
-        <w:t>39:     }</w:t>
+        <w:t>14:     }</w:t>
         <w:br/>
-        <w:t xml:space="preserve">40: </w:t>
+        <w:t xml:space="preserve">15: </w:t>
         <w:br/>
-        <w:t>41:     const candidate = await this.candidateRepo.getById(input.candidateID);</w:t>
+        <w:t>16:     const candidate = await this.candidateRepo.getById(input.candidateID);</w:t>
         <w:br/>
-        <w:t>42:     if (!candidate) throw new Error('Không tìm thấy thông tin ứng viên.');</w:t>
+        <w:t>17:     if (!candidate) throw new Error('Không tìm thấy thông tin ứng viên.');</w:t>
         <w:br/>
-        <w:t>43:     if (!candidate.getPersonal().email) throw new Error('Ứng viên chưa có email để gửi thư mời.');</w:t>
+        <w:t>18:     if (!candidate.getPersonal().email) throw new Error('Ứng viên chưa có email để gửi thư mời.');</w:t>
         <w:br/>
-        <w:t xml:space="preserve">44: </w:t>
+        <w:t xml:space="preserve">19: </w:t>
         <w:br/>
-        <w:t>45:     const job = await this.jobRepo.getById(input.jobID);</w:t>
+        <w:t>20:     const job = await this.jobRepo.getById(input.jobID);</w:t>
         <w:br/>
-        <w:t>46:     if (!job) throw new Error('Không tìm thấy thông tin công việc (Job).');</w:t>
+        <w:t>21:     if (!job) throw new Error('Không tìm thấy thông tin công việc (Job).');</w:t>
         <w:br/>
-        <w:t xml:space="preserve">47: </w:t>
+        <w:t xml:space="preserve">22: </w:t>
         <w:br/>
-        <w:t>48:     const analysis = await this.aiAnalysisRepo.getAnalysisByCandidateId(input.candidateID);</w:t>
+        <w:t>23:     const analysis = await this.aiAnalysisRepo.getAnalysisByCandidateId(input.candidateID);</w:t>
         <w:br/>
-        <w:t>49:     if (!analysis) throw new Error('Ứng viên chưa được AI phân tích. Vui lòng chạy phân tích trước khi đặt lịch.');</w:t>
+        <w:t>24:     if (!analysis) throw new Error('Ứng viên chưa được AI phân tích. Vui lòng chạy phân tích trước khi đặt lịch.');</w:t>
         <w:br/>
-        <w:t xml:space="preserve">50: </w:t>
+        <w:t xml:space="preserve">25: </w:t>
         <w:br/>
-        <w:t>51:     const isOverlap = await this.interviewScheduleRepo.checkOverlap(input.userId, input.time, input.durationMinutes);</w:t>
+        <w:t>26:     const isOverlap = await this.interviewScheduleRepo.checkOverlap(input.userId, input.time, input.durationMinutes);</w:t>
         <w:br/>
-        <w:t>52:     if (isOverlap) {</w:t>
+        <w:t>27:     if (isOverlap) {</w:t>
         <w:br/>
-        <w:t>53:       throw new Error('Khung giờ này đã có lịch khác. Vui lòng chọn giờ lại');</w:t>
+        <w:t>28:       throw new Error('Khung giờ này đã có lịch khác. Vui lòng chọn giờ lại');</w:t>
         <w:br/>
-        <w:t>54:     }</w:t>
+        <w:t>29:     }</w:t>
         <w:br/>
-        <w:t xml:space="preserve">55: </w:t>
+        <w:t xml:space="preserve">30: </w:t>
         <w:br/>
-        <w:t>56:     const created = await this.interviewScheduleRepo.createSchedule({</w:t>
+        <w:t>31:     const created = await this.interviewScheduleRepo.createSchedule({</w:t>
         <w:br/>
-        <w:t>57:       time: input.time,</w:t>
+        <w:t>32:       time: input.time,</w:t>
         <w:br/>
-        <w:t>58:       address: input.address,</w:t>
+        <w:t>33:       address: input.address,</w:t>
         <w:br/>
-        <w:t>59:       candidateId: input.candidateID,</w:t>
+        <w:t>34:       candidateId: input.candidateID,</w:t>
         <w:br/>
-        <w:t>60:       userId: input.userId,</w:t>
+        <w:t>35:       userId: input.userId,</w:t>
         <w:br/>
-        <w:t>61:       status: 'scheduled',</w:t>
+        <w:t>36:       status: 'scheduled',</w:t>
         <w:br/>
-        <w:t>62:     });</w:t>
+        <w:t>37:     });</w:t>
         <w:br/>
-        <w:t>63:     if (!created) throw new Error('Không thể tạo lịch phỏng vấn.');</w:t>
+        <w:t>38:     if (!created) throw new Error('Không thể tạo lịch phỏng vấn.');</w:t>
         <w:br/>
-        <w:t xml:space="preserve">64: </w:t>
+        <w:t xml:space="preserve">39: </w:t>
         <w:br/>
-        <w:t>65:     const invite = buildInterviewCalendarInvite({</w:t>
+        <w:t>40:     const invite = buildInterviewCalendarInvite({</w:t>
         <w:br/>
-        <w:t>66:       uid: `${created.getId()}@hr-agent`,</w:t>
+        <w:t>41:       uid: `${created.getId()}@hr-agent`,</w:t>
         <w:br/>
-        <w:t>67:       startTime: input.time,</w:t>
+        <w:t>42:       startTime: input.time,</w:t>
         <w:br/>
-        <w:t>68:       durationMinutes: input.durationMinutes,</w:t>
+        <w:t>43:       durationMinutes: input.durationMinutes,</w:t>
         <w:br/>
-        <w:t>69:       summary: `Phỏng vấn - ${job.getTitle()}`,</w:t>
+        <w:t>44:       summary: `Phỏng vấn - ${job.getTitle()}`,</w:t>
         <w:br/>
-        <w:t>70:       description: [</w:t>
+        <w:t>45:       description: [</w:t>
         <w:br/>
-        <w:t>71:         `Phỏng vấn vị trí: ${job.getTitle()}`,</w:t>
+        <w:t>46:         `Phỏng vấn vị trí: ${job.getTitle()}`,</w:t>
         <w:br/>
-        <w:t>72:         `Ghi chú: ${input.notes ?? ''}`,</w:t>
+        <w:t>47:         `Ghi chú: ${input.notes ?? ''}`,</w:t>
         <w:br/>
-        <w:t>73:       ].filter(Boolean).join('\n'),</w:t>
+        <w:t>48:       ].filter(Boolean).join('\n'),</w:t>
         <w:br/>
-        <w:t>74:       location: input.address,</w:t>
+        <w:t>49:       location: input.address,</w:t>
         <w:br/>
-        <w:t>75:       organizerEmail: process.env.MAIL_USER,</w:t>
+        <w:t>50:       organizerEmail: process.env.MAIL_USER,</w:t>
         <w:br/>
-        <w:t>76:       attendeeEmail: candidate.getPersonal().email,</w:t>
+        <w:t>51:       attendeeEmail: candidate.getPersonal().email,</w:t>
         <w:br/>
-        <w:t>77:     });</w:t>
+        <w:t>52:     });</w:t>
         <w:br/>
-        <w:t xml:space="preserve">78: </w:t>
+        <w:t xml:space="preserve">53: </w:t>
         <w:br/>
-        <w:t>79:     const emailPayload = {</w:t>
+        <w:t>54:     const emailPayload = {</w:t>
         <w:br/>
-        <w:t>80:       candidate: {</w:t>
+        <w:t>55:       candidate: {</w:t>
         <w:br/>
-        <w:t>81:         fullName: candidate.getPersonal().fullName,</w:t>
+        <w:t>56:         fullName: candidate.getPersonal().fullName,</w:t>
         <w:br/>
-        <w:t>82:         email: candidate.getPersonal().email,</w:t>
+        <w:t>57:         email: candidate.getPersonal().email,</w:t>
         <w:br/>
-        <w:t>83:       },</w:t>
+        <w:t>58:       },</w:t>
         <w:br/>
-        <w:t>84:       job: job.getDetailJob(),</w:t>
+        <w:t>59:       job: job.getDetailJob(),</w:t>
         <w:br/>
-        <w:t>85:       schedule: {</w:t>
+        <w:t>60:       schedule: {</w:t>
         <w:br/>
-        <w:t>86:         time: input.time.toISOString(),</w:t>
+        <w:t>61:         time: input.time.toISOString(),</w:t>
         <w:br/>
-        <w:t>87:         durationMinutes: input.durationMinutes,</w:t>
+        <w:t>62:         durationMinutes: input.durationMinutes,</w:t>
         <w:br/>
-        <w:t>88:         address: input.address,</w:t>
+        <w:t>63:         address: input.address,</w:t>
+        <w:br/>
+        <w:t>64:       },</w:t>
+        <w:br/>
+        <w:t>65:       aiAnalysis: analysis,</w:t>
+        <w:br/>
+        <w:t>66:       notes: input.notes ?? '',</w:t>
+        <w:br/>
+        <w:t>67:     };</w:t>
+        <w:br/>
+        <w:t xml:space="preserve">68: </w:t>
+        <w:br/>
+        <w:t>69:     let subject = `Thư mời phỏng vấn - ${job.getTitle()}`;</w:t>
+        <w:br/>
+        <w:t>70:     let html = `&lt;p&gt;Xin chào ${candidate.getPersonal().fullName || 'bạn'},&lt;/p&gt;&lt;p&gt;Chúng tôi xin mời bạn tham gia phỏng vấn cho vị trí &lt;b&gt;${job.getTitle()}&lt;/b&gt;.&lt;/p&gt;`;</w:t>
+        <w:br/>
+        <w:t xml:space="preserve">71: </w:t>
+        <w:br/>
+        <w:t>72:     try {</w:t>
+        <w:br/>
+        <w:t>73:       const generated = await this.geminiSvc.generateInterviewEmail(emailPayload);</w:t>
+        <w:br/>
+        <w:t>74:       if (generated?.subject?.trim()) {</w:t>
+        <w:br/>
+        <w:t>75:         subject = generated.subject.trim();</w:t>
+        <w:br/>
+        <w:t>76:       }</w:t>
+        <w:br/>
+        <w:t>77:       if (generated?.html) {</w:t>
+        <w:br/>
+        <w:t>78:         html = generated.html;</w:t>
+        <w:br/>
+        <w:t>79:       }</w:t>
+        <w:br/>
+        <w:t>80:     } catch (e) {</w:t>
+        <w:br/>
+        <w:t>81:       console.warn('Không thể tạo email bằng AI, sử dụng mẫu mặc định.');</w:t>
+        <w:br/>
+        <w:t>82:     }</w:t>
+        <w:br/>
+        <w:t xml:space="preserve">83: </w:t>
+        <w:br/>
+        <w:t>84:     const emailSent = await this.mailSvc.sendEmail(candidate.getPersonal().email, subject, html, [</w:t>
+        <w:br/>
+        <w:t>85:       {</w:t>
+        <w:br/>
+        <w:t>86:         filename: invite.filename,</w:t>
+        <w:br/>
+        <w:t>87:         content: invite.content,</w:t>
+        <w:br/>
+        <w:t>88:         contentType: invite.contentType,</w:t>
         <w:br/>
         <w:t>89:       },</w:t>
         <w:br/>
-        <w:t>90:       aiAnalysis: analysis,</w:t>
+        <w:t>90:     ]);</w:t>
         <w:br/>
-        <w:t>91:       notes: input.notes ?? '',</w:t>
+        <w:t xml:space="preserve">91: </w:t>
         <w:br/>
-        <w:t>92:     };</w:t>
+        <w:t>92:     await this.candidateRepo.updateStatus(input.candidateID, { status: CandidateStatus.INTERVIEW });</w:t>
         <w:br/>
         <w:t xml:space="preserve">93: </w:t>
         <w:br/>
-        <w:t>94:     let subject = `Thư mời phỏng vấn - ${job.getTitle()}`;</w:t>
+        <w:t>94:     return { schedule: created.getDetail(), emailSent };</w:t>
         <w:br/>
-        <w:t>95:     let html = `&lt;p&gt;Xin chào ${candidate.getPersonal().fullName || 'bạn'},&lt;/p&gt;&lt;p&gt;Chúng tôi xin mời bạn tham gia phỏng vấn cho vị trí &lt;b&gt;${job.getTitle()}&lt;/b&gt;.&lt;/p&gt;`;</w:t>
+        <w:t>95:   }</w:t>
         <w:br/>
-        <w:t xml:space="preserve">96: </w:t>
-        <w:br/>
-        <w:t>97:     try {</w:t>
-        <w:br/>
-        <w:t>98:       const generated = await this.geminiSvc.generateInterviewEmail(emailPayload);</w:t>
-        <w:br/>
-        <w:t>99:       if (generated?.subject?.trim()) {</w:t>
-        <w:br/>
-        <w:t>100:        subject = generated.subject.trim();</w:t>
-        <w:br/>
-        <w:t>101:      }</w:t>
-        <w:br/>
-        <w:t>102:      if (generated?.html) {</w:t>
-        <w:br/>
-        <w:t>103:        html = generated.html;</w:t>
-        <w:br/>
-        <w:t>104:      }</w:t>
-        <w:br/>
-        <w:t>105:    } catch (e) {</w:t>
-        <w:br/>
-        <w:t>106:      console.warn('Không thể tạo email bằng AI, sử dụng mẫu mặc định.');</w:t>
-        <w:br/>
-        <w:t>107:    }</w:t>
-        <w:br/>
-        <w:t xml:space="preserve">108: </w:t>
-        <w:br/>
-        <w:t>109:    const emailSent = await this.mailSvc.sendEmail(candidate.getPersonal().email, subject, html, [</w:t>
-        <w:br/>
-        <w:t>110:      {</w:t>
-        <w:br/>
-        <w:t>111:        filename: invite.filename,</w:t>
-        <w:br/>
-        <w:t>112:        content: invite.content,</w:t>
-        <w:br/>
-        <w:t>113:        contentType: invite.contentType,</w:t>
-        <w:br/>
-        <w:t>114:      },</w:t>
-        <w:br/>
-        <w:t>115:    ]);</w:t>
-        <w:br/>
-        <w:t xml:space="preserve">116: </w:t>
-        <w:br/>
-        <w:t>117:    await this.candidateRepo.updateStatus(input.candidateID, { status: CandidateStatus.INTERVIEW });</w:t>
-        <w:br/>
-        <w:t xml:space="preserve">118: </w:t>
-        <w:br/>
-        <w:t>119:    return { schedule: created.getDetail(), emailSent };</w:t>
-        <w:br/>
-        <w:t>120:  }</w:t>
-        <w:br/>
-        <w:t>121:}</w:t>
+        <w:t>96: }</w:t>
       </w:r>
     </w:p>
     <w:p/>
@@ -704,7 +704,7 @@
               <w:rPr>
                 <w:sz w:val="17"/>
               </w:rPr>
-              <w:t>Dòng 36</w:t>
+              <w:t>Dòng 11</w:t>
             </w:r>
           </w:p>
         </w:tc>
@@ -785,7 +785,7 @@
               <w:rPr>
                 <w:sz w:val="17"/>
               </w:rPr>
-              <w:t>Dòng 37–38</w:t>
+              <w:t>Dòng 12–14</w:t>
             </w:r>
           </w:p>
         </w:tc>
@@ -866,7 +866,7 @@
               <w:rPr>
                 <w:sz w:val="17"/>
               </w:rPr>
-              <w:t>Dòng 38</w:t>
+              <w:t>Dòng 13</w:t>
             </w:r>
           </w:p>
         </w:tc>
@@ -947,7 +947,7 @@
               <w:rPr>
                 <w:sz w:val="17"/>
               </w:rPr>
-              <w:t>Dòng 41–42</w:t>
+              <w:t>Dòng 16–17</w:t>
             </w:r>
           </w:p>
         </w:tc>
@@ -1028,7 +1028,7 @@
               <w:rPr>
                 <w:sz w:val="17"/>
               </w:rPr>
-              <w:t>Dòng 42</w:t>
+              <w:t>Dòng 17</w:t>
             </w:r>
           </w:p>
         </w:tc>
@@ -1109,7 +1109,7 @@
               <w:rPr>
                 <w:sz w:val="17"/>
               </w:rPr>
-              <w:t>Dòng 43</w:t>
+              <w:t>Dòng 18</w:t>
             </w:r>
           </w:p>
         </w:tc>
@@ -1190,7 +1190,7 @@
               <w:rPr>
                 <w:sz w:val="17"/>
               </w:rPr>
-              <w:t>Dòng 43</w:t>
+              <w:t>Dòng 18</w:t>
             </w:r>
           </w:p>
         </w:tc>
@@ -1271,7 +1271,7 @@
               <w:rPr>
                 <w:sz w:val="17"/>
               </w:rPr>
-              <w:t>Dòng 45–46</w:t>
+              <w:t>Dòng 20–21</w:t>
             </w:r>
           </w:p>
         </w:tc>
@@ -1352,7 +1352,7 @@
               <w:rPr>
                 <w:sz w:val="17"/>
               </w:rPr>
-              <w:t>Dòng 46</w:t>
+              <w:t>Dòng 21</w:t>
             </w:r>
           </w:p>
         </w:tc>
@@ -1433,7 +1433,7 @@
               <w:rPr>
                 <w:sz w:val="17"/>
               </w:rPr>
-              <w:t>Dòng 48–49</w:t>
+              <w:t>Dòng 23–24</w:t>
             </w:r>
           </w:p>
         </w:tc>
@@ -1514,7 +1514,7 @@
               <w:rPr>
                 <w:sz w:val="17"/>
               </w:rPr>
-              <w:t>Dòng 49</w:t>
+              <w:t>Dòng 24</w:t>
             </w:r>
           </w:p>
         </w:tc>
@@ -1595,7 +1595,7 @@
               <w:rPr>
                 <w:sz w:val="17"/>
               </w:rPr>
-              <w:t>Dòng 51–53</w:t>
+              <w:t>Dòng 26–29</w:t>
             </w:r>
           </w:p>
         </w:tc>
@@ -1676,7 +1676,7 @@
               <w:rPr>
                 <w:sz w:val="17"/>
               </w:rPr>
-              <w:t>Dòng 53</w:t>
+              <w:t>Dòng 28</w:t>
             </w:r>
           </w:p>
         </w:tc>
@@ -1757,7 +1757,7 @@
               <w:rPr>
                 <w:sz w:val="17"/>
               </w:rPr>
-              <w:t>Dòng 56–63</w:t>
+              <w:t>Dòng 31–38</w:t>
             </w:r>
           </w:p>
         </w:tc>
@@ -1838,7 +1838,7 @@
               <w:rPr>
                 <w:sz w:val="17"/>
               </w:rPr>
-              <w:t>Dòng 63</w:t>
+              <w:t>Dòng 38</w:t>
             </w:r>
           </w:p>
         </w:tc>
@@ -1919,7 +1919,7 @@
               <w:rPr>
                 <w:sz w:val="17"/>
               </w:rPr>
-              <w:t>Dòng 65–95</w:t>
+              <w:t>Dòng 40–70</w:t>
             </w:r>
           </w:p>
         </w:tc>
@@ -2000,7 +2000,7 @@
               <w:rPr>
                 <w:sz w:val="17"/>
               </w:rPr>
-              <w:t>Dòng 97–104</w:t>
+              <w:t>Dòng 72–79</w:t>
             </w:r>
           </w:p>
         </w:tc>
@@ -2081,7 +2081,7 @@
               <w:rPr>
                 <w:sz w:val="17"/>
               </w:rPr>
-              <w:t>Dòng 105–107</w:t>
+              <w:t>Dòng 80–82</w:t>
             </w:r>
           </w:p>
         </w:tc>
@@ -2162,7 +2162,7 @@
               <w:rPr>
                 <w:sz w:val="17"/>
               </w:rPr>
-              <w:t>Dòng 109–117</w:t>
+              <w:t>Dòng 84–92</w:t>
             </w:r>
           </w:p>
         </w:tc>
@@ -2243,7 +2243,7 @@
               <w:rPr>
                 <w:sz w:val="17"/>
               </w:rPr>
-              <w:t>Dòng 119</w:t>
+              <w:t>Dòng 94</w:t>
             </w:r>
           </w:p>
         </w:tc>

</xml_diff>